<commit_message>
Apps 2.2.0: resolução de 0,1° no cartão de cada eixo, lembrada entre sessões
A opção de 0,1° existia só em Configurações, voltava a 0,25° a cada
abertura do app e, com a histerese fixa de 0,05°, deixava a tela até 0,1°
atrás da leitura.

- seletor "Resolução: 0,25° / 0,1°" no cartão de cada eixo (desktop e
  Android), também em Configurações; troca vale na hora, por eixo
- escolha gravada (desktop: QSettings .ini; Android: SharedPreferences)
- histerese proporcional ao degrau (20%): atraso máximo 0,07° em 0,1°
- uma casa decimal em 0,1° ("12.3°")
- regra única em ui/angle_display.py e ui/AngleDisplay.kt
- testes: sim/exibicao_test.py (regra + janela real em Qt offscreen) e
  sim/AngleDisplayTest.kt (kotlinc puro; mesmos valores nos dois apps),
  incluídos no sim/run.sh
- docs: READMEs, relatório técnico rev. 07, PTE rev. 01, índice de docs

Co-Authored-By: Claude Opus 5.5 <noreply@anthropic.com>
Claude-Session: https://claude.ai/code/session_01VvvtJDPvh4mDoSVpkHza1d
</commit_message>
<xml_diff>
--- a/docs/procedimento-teste-funcional-bancada.docx
+++ b/docs/procedimento-teste-funcional-bancada.docx
@@ -186,7 +186,7 @@
                 <w:sz w:val="21"/>
                 <w:szCs w:val="21"/>
               </w:rPr>
-              <w:t xml:space="preserve">REVISÃO: 00</w:t>
+              <w:t>REVISÃO: 01</w:t>
             </w:r>
           </w:p>
         </w:tc>
@@ -2325,6 +2325,45 @@
     </w:p>
     <w:p>
       <w:pPr>
+        <w:spacing w:after="100" w:line="264" w:lineRule="auto"/>
+        <w:ind w:left="500" w:hanging="300"/>
+        <w:jc w:val="both"/>
+      </w:pPr>
+      <w:r>
+        <w:rPr>
+          <w:rFonts w:ascii="Arial" w:cs="Arial" w:eastAsia="Arial" w:hAnsi="Arial"/>
+          <w:b/>
+          <w:bCs/>
+          <w:sz w:val="21"/>
+          <w:szCs w:val="21"/>
+        </w:rPr>
+        <w:t xml:space="preserve">4. </w:t>
+      </w:r>
+      <w:r>
+        <w:rPr>
+          <w:rFonts w:ascii="Arial" w:cs="Arial" w:eastAsia="Arial" w:hAnsi="Arial"/>
+          <w:sz w:val="21"/>
+          <w:szCs w:val="21"/>
+        </w:rPr>
+        <w:t>No cartão de cada eixo, trocar "Resolução" de 0,25° para 0,1° (inclinação e azimute, um de cada vez); depois fechar e abrir de novo o software.</w:t>
+      </w:r>
+    </w:p>
+    <w:p>
+      <w:pPr>
+        <w:spacing w:after="160" w:before="0" w:line="264" w:lineRule="auto"/>
+        <w:jc w:val="both"/>
+      </w:pPr>
+      <w:r>
+        <w:rPr>
+          <w:rFonts w:ascii="Arial" w:cs="Arial" w:eastAsia="Arial" w:hAnsi="Arial"/>
+          <w:sz w:val="21"/>
+          <w:szCs w:val="21"/>
+        </w:rPr>
+        <w:t>Resultado esperado: o eixo alterado passa na hora a mostrar o valor com uma casa decimal (ex.: 12.3°), sem tremular com o conjunto em repouso, e o outro eixo não muda; ao reabrir, a escolha de cada eixo é mantida. O mesmo seletor aparece em Configurações.</w:t>
+      </w:r>
+    </w:p>
+    <w:p>
+      <w:pPr>
         <w:keepNext/>
         <w:spacing w:after="120" w:before="200"/>
         <w:ind w:left="0"/>
@@ -3377,7 +3416,7 @@
                 <w:sz w:val="21"/>
                 <w:szCs w:val="21"/>
               </w:rPr>
-              <w:t xml:space="preserve">Leitura contínua dos dois eixos (tilt e pan)</w:t>
+              <w:t>Leitura contínua dos dois eixos (tilt e pan), incl. resolução 0,25°/0,1°</w:t>
             </w:r>
           </w:p>
         </w:tc>

</xml_diff>